<commit_message>
Formation skills : ajout du prerequis conditions d'acces (compte gratuit app vs Claude Code payant) ; README sans lien PDF (PDF ignore par .gitignore)
</commit_message>
<xml_diff>
--- a/CLAUDE/Formation_Creer_des_Skills/Livret_stagiaire_Creer_des_Skills.docx
+++ b/CLAUDE/Formation_Creer_des_Skills/Livret_stagiaire_Creer_des_Skills.docx
@@ -127,7 +127,7 @@
           <w:sz w:val="20"/>
           <w:szCs w:val="20"/>
         </w:rPr>
-        <w:t xml:space="preserve">Avoir déjà utilisé Claude (app bureau ou Claude Code), notions de fichiers et dossiers</w:t>
+        <w:t xml:space="preserve">Avoir déjà utilisé Claude ; notions de fichiers et dossiers. Compte Pro/Max ou clé API requis pour les TP (Claude Code)</w:t>
       </w:r>
     </w:p>
     <w:p>
@@ -207,6 +207,20 @@
           <w:iCs w:val="false"/>
         </w:rPr>
         <w:t xml:space="preserve">Objectifs et programme de la journée</w:t>
+      </w:r>
+    </w:p>
+    <w:p>
+      <w:pPr>
+        <w:spacing w:after="80" w:line="264"/>
+      </w:pPr>
+      <w:r>
+        <w:rPr>
+          <w:b w:val="false"/>
+          <w:bCs w:val="false"/>
+          <w:i w:val="false"/>
+          <w:iCs w:val="false"/>
+        </w:rPr>
+        <w:t xml:space="preserve">Conditions d'accès et prérequis techniques</w:t>
       </w:r>
     </w:p>
     <w:p>
@@ -1912,6 +1926,430 @@
         </w:tc>
       </w:tr>
     </w:tbl>
+    <w:p>
+      <w:r>
+        <w:br w:type="page"/>
+      </w:r>
+    </w:p>
+    <w:p>
+      <w:pPr>
+        <w:pStyle w:val="Heading1"/>
+      </w:pPr>
+      <w:r>
+        <w:t xml:space="preserve">Conditions d'accès et prérequis techniques</w:t>
+      </w:r>
+    </w:p>
+    <w:p>
+      <w:pPr>
+        <w:spacing w:after="120" w:line="264"/>
+      </w:pPr>
+      <w:r>
+        <w:t xml:space="preserve">L'accès aux compétences dépend de l'environnement utilisé. Le tableau ci-dessous précise ce qui nécessite un compte payant.</w:t>
+      </w:r>
+    </w:p>
+    <w:tbl>
+      <w:tblPr>
+        <w:tblW w:type="dxa" w:w="9360"/>
+        <w:tblBorders>
+          <w:top w:val="single" w:color="auto" w:sz="4"/>
+          <w:left w:val="single" w:color="auto" w:sz="4"/>
+          <w:bottom w:val="single" w:color="auto" w:sz="4"/>
+          <w:right w:val="single" w:color="auto" w:sz="4"/>
+          <w:insideH w:val="single" w:color="auto" w:sz="4"/>
+          <w:insideV w:val="single" w:color="auto" w:sz="4"/>
+        </w:tblBorders>
+      </w:tblPr>
+      <w:tblGrid>
+        <w:gridCol w:w="2600"/>
+        <w:gridCol w:w="3100"/>
+        <w:gridCol w:w="3660"/>
+      </w:tblGrid>
+      <w:tr>
+        <w:trPr>
+          <w:tblHeader/>
+        </w:trPr>
+        <w:tc>
+          <w:tcPr>
+            <w:tcW w:type="dxa" w:w="2600"/>
+            <w:tcBorders>
+              <w:top w:val="single" w:color="BBBBBB" w:sz="1"/>
+              <w:left w:val="single" w:color="BBBBBB" w:sz="1"/>
+              <w:bottom w:val="single" w:color="BBBBBB" w:sz="1"/>
+              <w:right w:val="single" w:color="BBBBBB" w:sz="1"/>
+            </w:tcBorders>
+            <w:shd w:fill="1F3864" w:val="clear"/>
+            <w:tcMar>
+              <w:top w:type="dxa" w:w="60"/>
+              <w:left w:type="dxa" w:w="110"/>
+              <w:bottom w:type="dxa" w:w="60"/>
+              <w:right w:type="dxa" w:w="110"/>
+            </w:tcMar>
+          </w:tcPr>
+          <w:p>
+            <w:pPr>
+              <w:spacing w:after="0" w:line="248"/>
+            </w:pPr>
+            <w:r>
+              <w:rPr>
+                <w:b/>
+                <w:bCs/>
+                <w:color w:val="FFFFFF"/>
+                <w:sz w:val="19"/>
+                <w:szCs w:val="19"/>
+              </w:rPr>
+              <w:t xml:space="preserve">Environnement</w:t>
+            </w:r>
+          </w:p>
+        </w:tc>
+        <w:tc>
+          <w:tcPr>
+            <w:tcW w:type="dxa" w:w="3100"/>
+            <w:tcBorders>
+              <w:top w:val="single" w:color="BBBBBB" w:sz="1"/>
+              <w:left w:val="single" w:color="BBBBBB" w:sz="1"/>
+              <w:bottom w:val="single" w:color="BBBBBB" w:sz="1"/>
+              <w:right w:val="single" w:color="BBBBBB" w:sz="1"/>
+            </w:tcBorders>
+            <w:shd w:fill="1F3864" w:val="clear"/>
+            <w:tcMar>
+              <w:top w:type="dxa" w:w="60"/>
+              <w:left w:type="dxa" w:w="110"/>
+              <w:bottom w:type="dxa" w:w="60"/>
+              <w:right w:type="dxa" w:w="110"/>
+            </w:tcMar>
+          </w:tcPr>
+          <w:p>
+            <w:pPr>
+              <w:spacing w:after="0" w:line="248"/>
+            </w:pPr>
+            <w:r>
+              <w:rPr>
+                <w:b/>
+                <w:bCs/>
+                <w:color w:val="FFFFFF"/>
+                <w:sz w:val="19"/>
+                <w:szCs w:val="19"/>
+              </w:rPr>
+              <w:t xml:space="preserve">Compte nécessaire</w:t>
+            </w:r>
+          </w:p>
+        </w:tc>
+        <w:tc>
+          <w:tcPr>
+            <w:tcW w:type="dxa" w:w="3660"/>
+            <w:tcBorders>
+              <w:top w:val="single" w:color="BBBBBB" w:sz="1"/>
+              <w:left w:val="single" w:color="BBBBBB" w:sz="1"/>
+              <w:bottom w:val="single" w:color="BBBBBB" w:sz="1"/>
+              <w:right w:val="single" w:color="BBBBBB" w:sz="1"/>
+            </w:tcBorders>
+            <w:shd w:fill="1F3864" w:val="clear"/>
+            <w:tcMar>
+              <w:top w:type="dxa" w:w="60"/>
+              <w:left w:type="dxa" w:w="110"/>
+              <w:bottom w:type="dxa" w:w="60"/>
+              <w:right w:type="dxa" w:w="110"/>
+            </w:tcMar>
+          </w:tcPr>
+          <w:p>
+            <w:pPr>
+              <w:spacing w:after="0" w:line="248"/>
+            </w:pPr>
+            <w:r>
+              <w:rPr>
+                <w:b/>
+                <w:bCs/>
+                <w:color w:val="FFFFFF"/>
+                <w:sz w:val="19"/>
+                <w:szCs w:val="19"/>
+              </w:rPr>
+              <w:t xml:space="preserve">Ce que vous pouvez faire</w:t>
+            </w:r>
+          </w:p>
+        </w:tc>
+      </w:tr>
+      <w:tr>
+        <w:tc>
+          <w:tcPr>
+            <w:tcW w:type="dxa" w:w="2600"/>
+            <w:tcBorders>
+              <w:top w:val="single" w:color="BBBBBB" w:sz="1"/>
+              <w:left w:val="single" w:color="BBBBBB" w:sz="1"/>
+              <w:bottom w:val="single" w:color="BBBBBB" w:sz="1"/>
+              <w:right w:val="single" w:color="BBBBBB" w:sz="1"/>
+            </w:tcBorders>
+            <w:tcMar>
+              <w:top w:type="dxa" w:w="60"/>
+              <w:left w:type="dxa" w:w="110"/>
+              <w:bottom w:type="dxa" w:w="60"/>
+              <w:right w:type="dxa" w:w="110"/>
+            </w:tcMar>
+          </w:tcPr>
+          <w:p>
+            <w:pPr>
+              <w:spacing w:after="0" w:line="248"/>
+            </w:pPr>
+            <w:r>
+              <w:rPr>
+                <w:b w:val="false"/>
+                <w:bCs w:val="false"/>
+                <w:sz w:val="19"/>
+                <w:szCs w:val="19"/>
+              </w:rPr>
+              <w:t xml:space="preserve">Application Claude (bureau / web)</w:t>
+            </w:r>
+          </w:p>
+        </w:tc>
+        <w:tc>
+          <w:tcPr>
+            <w:tcW w:type="dxa" w:w="3100"/>
+            <w:tcBorders>
+              <w:top w:val="single" w:color="BBBBBB" w:sz="1"/>
+              <w:left w:val="single" w:color="BBBBBB" w:sz="1"/>
+              <w:bottom w:val="single" w:color="BBBBBB" w:sz="1"/>
+              <w:right w:val="single" w:color="BBBBBB" w:sz="1"/>
+            </w:tcBorders>
+            <w:tcMar>
+              <w:top w:type="dxa" w:w="60"/>
+              <w:left w:type="dxa" w:w="110"/>
+              <w:bottom w:type="dxa" w:w="60"/>
+              <w:right w:type="dxa" w:w="110"/>
+            </w:tcMar>
+          </w:tcPr>
+          <w:p>
+            <w:pPr>
+              <w:spacing w:after="0" w:line="248"/>
+            </w:pPr>
+            <w:r>
+              <w:rPr>
+                <w:b w:val="false"/>
+                <w:bCs w:val="false"/>
+                <w:sz w:val="19"/>
+                <w:szCs w:val="19"/>
+              </w:rPr>
+              <w:t xml:space="preserve">Compte gratuit suffisant ; Pro ou Max recommandé</w:t>
+            </w:r>
+          </w:p>
+        </w:tc>
+        <w:tc>
+          <w:tcPr>
+            <w:tcW w:type="dxa" w:w="3660"/>
+            <w:tcBorders>
+              <w:top w:val="single" w:color="BBBBBB" w:sz="1"/>
+              <w:left w:val="single" w:color="BBBBBB" w:sz="1"/>
+              <w:bottom w:val="single" w:color="BBBBBB" w:sz="1"/>
+              <w:right w:val="single" w:color="BBBBBB" w:sz="1"/>
+            </w:tcBorders>
+            <w:tcMar>
+              <w:top w:type="dxa" w:w="60"/>
+              <w:left w:type="dxa" w:w="110"/>
+              <w:bottom w:type="dxa" w:w="60"/>
+              <w:right w:type="dxa" w:w="110"/>
+            </w:tcMar>
+          </w:tcPr>
+          <w:p>
+            <w:pPr>
+              <w:spacing w:after="0" w:line="248"/>
+            </w:pPr>
+            <w:r>
+              <w:rPr>
+                <w:b w:val="false"/>
+                <w:bCs w:val="false"/>
+                <w:sz w:val="19"/>
+                <w:szCs w:val="19"/>
+              </w:rPr>
+              <w:t xml:space="preserve">Utiliser et créer des compétences. Activer « Exécution de code et création de fichiers » dans Paramètres &gt; Capacités. Limites d'usage plus serrées en gratuit.</w:t>
+            </w:r>
+          </w:p>
+        </w:tc>
+      </w:tr>
+      <w:tr>
+        <w:tc>
+          <w:tcPr>
+            <w:tcW w:type="dxa" w:w="2600"/>
+            <w:tcBorders>
+              <w:top w:val="single" w:color="BBBBBB" w:sz="1"/>
+              <w:left w:val="single" w:color="BBBBBB" w:sz="1"/>
+              <w:bottom w:val="single" w:color="BBBBBB" w:sz="1"/>
+              <w:right w:val="single" w:color="BBBBBB" w:sz="1"/>
+            </w:tcBorders>
+            <w:tcMar>
+              <w:top w:type="dxa" w:w="60"/>
+              <w:left w:type="dxa" w:w="110"/>
+              <w:bottom w:type="dxa" w:w="60"/>
+              <w:right w:type="dxa" w:w="110"/>
+            </w:tcMar>
+          </w:tcPr>
+          <w:p>
+            <w:pPr>
+              <w:spacing w:after="0" w:line="248"/>
+            </w:pPr>
+            <w:r>
+              <w:rPr>
+                <w:b w:val="false"/>
+                <w:bCs w:val="false"/>
+                <w:sz w:val="19"/>
+                <w:szCs w:val="19"/>
+              </w:rPr>
+              <w:t xml:space="preserve">Claude Code (ligne de commande)</w:t>
+            </w:r>
+          </w:p>
+        </w:tc>
+        <w:tc>
+          <w:tcPr>
+            <w:tcW w:type="dxa" w:w="3100"/>
+            <w:tcBorders>
+              <w:top w:val="single" w:color="BBBBBB" w:sz="1"/>
+              <w:left w:val="single" w:color="BBBBBB" w:sz="1"/>
+              <w:bottom w:val="single" w:color="BBBBBB" w:sz="1"/>
+              <w:right w:val="single" w:color="BBBBBB" w:sz="1"/>
+            </w:tcBorders>
+            <w:tcMar>
+              <w:top w:type="dxa" w:w="60"/>
+              <w:left w:type="dxa" w:w="110"/>
+              <w:bottom w:type="dxa" w:w="60"/>
+              <w:right w:type="dxa" w:w="110"/>
+            </w:tcMar>
+          </w:tcPr>
+          <w:p>
+            <w:pPr>
+              <w:spacing w:after="0" w:line="248"/>
+            </w:pPr>
+            <w:r>
+              <w:rPr>
+                <w:b w:val="false"/>
+                <w:bCs w:val="false"/>
+                <w:sz w:val="19"/>
+                <w:szCs w:val="19"/>
+              </w:rPr>
+              <w:t xml:space="preserve">Abonnement Pro ou Max, ou accès API facturé (Console)</w:t>
+            </w:r>
+          </w:p>
+        </w:tc>
+        <w:tc>
+          <w:tcPr>
+            <w:tcW w:type="dxa" w:w="3660"/>
+            <w:tcBorders>
+              <w:top w:val="single" w:color="BBBBBB" w:sz="1"/>
+              <w:left w:val="single" w:color="BBBBBB" w:sz="1"/>
+              <w:bottom w:val="single" w:color="BBBBBB" w:sz="1"/>
+              <w:right w:val="single" w:color="BBBBBB" w:sz="1"/>
+            </w:tcBorders>
+            <w:tcMar>
+              <w:top w:type="dxa" w:w="60"/>
+              <w:left w:type="dxa" w:w="110"/>
+              <w:bottom w:type="dxa" w:w="60"/>
+              <w:right w:type="dxa" w:w="110"/>
+            </w:tcMar>
+          </w:tcPr>
+          <w:p>
+            <w:pPr>
+              <w:spacing w:after="0" w:line="248"/>
+            </w:pPr>
+            <w:r>
+              <w:rPr>
+                <w:b w:val="false"/>
+                <w:bCs w:val="false"/>
+                <w:sz w:val="19"/>
+                <w:szCs w:val="19"/>
+              </w:rPr>
+              <w:t xml:space="preserve">Réaliser les travaux pratiques tels qu'ils sont écrits (dossiers ~/.claude/skills, redémarrage, etc.). Non disponible en offre gratuite.</w:t>
+            </w:r>
+          </w:p>
+        </w:tc>
+      </w:tr>
+    </w:tbl>
+    <w:tbl>
+      <w:tblPr>
+        <w:tblW w:type="dxa" w:w="9360"/>
+        <w:tblBorders>
+          <w:top w:val="single" w:color="auto" w:sz="4"/>
+          <w:left w:val="single" w:color="auto" w:sz="4"/>
+          <w:bottom w:val="single" w:color="auto" w:sz="4"/>
+          <w:right w:val="single" w:color="auto" w:sz="4"/>
+          <w:insideH w:val="single" w:color="auto" w:sz="4"/>
+          <w:insideV w:val="single" w:color="auto" w:sz="4"/>
+        </w:tblBorders>
+      </w:tblPr>
+      <w:tblGrid>
+        <w:gridCol w:w="9360"/>
+      </w:tblGrid>
+      <w:tr>
+        <w:tc>
+          <w:tcPr>
+            <w:tcW w:type="dxa" w:w="9360"/>
+            <w:tcBorders>
+              <w:top w:val="single" w:color="2E5496" w:sz="2"/>
+              <w:left w:val="single" w:color="1F3864" w:sz="12"/>
+              <w:bottom w:val="single" w:color="2E5496" w:sz="2"/>
+              <w:right w:val="single" w:color="2E5496" w:sz="2"/>
+            </w:tcBorders>
+            <w:shd w:fill="EAF0F8" w:val="clear"/>
+            <w:tcMar>
+              <w:top w:type="dxa" w:w="120"/>
+              <w:left w:type="dxa" w:w="160"/>
+              <w:bottom w:type="dxa" w:w="120"/>
+              <w:right w:type="dxa" w:w="160"/>
+            </w:tcMar>
+          </w:tcPr>
+          <w:p>
+            <w:pPr>
+              <w:spacing w:after="60"/>
+            </w:pPr>
+            <w:r>
+              <w:rPr>
+                <w:b/>
+                <w:bCs/>
+                <w:color w:val="1F3864"/>
+              </w:rPr>
+              <w:t xml:space="preserve">À noter</w:t>
+            </w:r>
+          </w:p>
+          <w:p>
+            <w:pPr>
+              <w:spacing w:after="40" w:line="256"/>
+            </w:pPr>
+            <w:r>
+              <w:t xml:space="preserve">Les 4 TP de cette formation s'appuient sur Claude Code : ils nécessitent un compte Pro ou Max, ou une clé API facturée. La partie théorique et la pratique dans l'application bureau restent accessibles avec un compte gratuit (capacités activées).</w:t>
+            </w:r>
+          </w:p>
+        </w:tc>
+      </w:tr>
+    </w:tbl>
+    <w:p>
+      <w:pPr>
+        <w:spacing w:after="120" w:line="264"/>
+      </w:pPr>
+      <w:r>
+        <w:rPr>
+          <w:b w:val="false"/>
+          <w:bCs w:val="false"/>
+          <w:i w:val="false"/>
+          <w:iCs w:val="false"/>
+        </w:rPr>
+        <w:t xml:space="preserve">Les conditions et tarifs évoluent : vérifier l'offre à jour sur </w:t>
+      </w:r>
+      <w:r>
+        <w:rPr>
+          <w:rFonts w:ascii="Consolas" w:cs="Consolas" w:eastAsia="Consolas" w:hAnsi="Consolas"/>
+          <w:b w:val="false"/>
+          <w:bCs w:val="false"/>
+          <w:i w:val="false"/>
+          <w:iCs w:val="false"/>
+          <w:shd w:fill="F2F2F2" w:val="clear"/>
+        </w:rPr>
+        <w:t xml:space="preserve">claude.com/pricing</w:t>
+      </w:r>
+      <w:r>
+        <w:rPr>
+          <w:b w:val="false"/>
+          <w:bCs w:val="false"/>
+          <w:i w:val="false"/>
+          <w:iCs w:val="false"/>
+        </w:rPr>
+        <w:t xml:space="preserve">.</w:t>
+      </w:r>
+    </w:p>
     <w:p>
       <w:r>
         <w:br w:type="page"/>

</xml_diff>